<commit_message>
Add a command ledger indexed by question, as the spec for a future docker-admin.sh
Chapters teach in the order things were learned, which is the wrong order for
investigating a live problem. COMMANDS.md reindexes every command this track
has run by the question it answers, adds a table for reading failure states,
and marks each entry as verified-here or standard-but-untested.

Writing it exposed a real gap: docker service ps, the command that disproved
our wrong theory about registry auth, was missing from both chapters' command
lists. Also absent were the base64 credential decode, service inspect --pretty,
and the scripted-vs-interactive login forms. All now present.

METHOD.md makes this a duty of the investigate stage rather than a documentation
afterthought, because reconstructing which commands mattered is archaeology
once there are a hundred of them - and a tool built from reconstructed guesses
would be worse than none.

Co-authored-by: Cursor <cursoragent@cursor.com>
</commit_message>
<xml_diff>
--- a/education/docker-swarm/docx/chapter01_building_the_cluster.docx
+++ b/education/docker-swarm/docx/chapter01_building_the_cluster.docx
@@ -2,7 +2,7 @@
 <file path=word/document.xml><?xml version="1.0" encoding="utf-8"?>
 <w:document xmlns:w="http://schemas.openxmlformats.org/wordprocessingml/2006/main" xmlns:m="http://schemas.openxmlformats.org/officeDocument/2006/math" xmlns:r="http://schemas.openxmlformats.org/officeDocument/2006/relationships" xmlns:o="urn:schemas-microsoft-com:office:office" xmlns:v="urn:schemas-microsoft-com:vml" xmlns:w10="urn:schemas-microsoft-com:office:word" xmlns:a="http://schemas.openxmlformats.org/drawingml/2006/main" xmlns:pic="http://schemas.openxmlformats.org/drawingml/2006/picture" xmlns:wp="http://schemas.openxmlformats.org/drawingml/2006/wordprocessingDrawing">
   <w:body>
-    <w:bookmarkStart w:id="31" w:name="chapter-1-building-the-cluster"/>
+    <w:bookmarkStart w:id="32" w:name="chapter-1-building-the-cluster"/>
     <w:p>
       <w:pPr>
         <w:pStyle w:val="Heading1"/>
@@ -4515,7 +4515,7 @@
       </w:r>
     </w:p>
     <w:bookmarkEnd w:id="27"/>
-    <w:bookmarkStart w:id="28" w:name="commands-to-know-by-heart"/>
+    <w:bookmarkStart w:id="29" w:name="commands-to-know-by-heart"/>
     <w:p>
       <w:pPr>
         <w:pStyle w:val="Heading2"/>
@@ -4956,6 +4956,79 @@
           <w:rStyle w:val="CommentTok"/>
         </w:rPr>
         <w:t xml:space="preserve"># demoting the last manager is refused</w:t>
+      </w:r>
+    </w:p>
+    <w:p>
+      <w:pPr>
+        <w:pStyle w:val="BlockText"/>
+      </w:pPr>
+      <w:r>
+        <w:t xml:space="preserve">📖</w:t>
+      </w:r>
+      <w:r>
+        <w:t xml:space="preserve"> </w:t>
+      </w:r>
+      <w:r>
+        <w:rPr>
+          <w:b/>
+          <w:bCs/>
+        </w:rPr>
+        <w:t xml:space="preserve">Every command this track has used, organised by the question it answers rather than the chapter</w:t>
+      </w:r>
+      <w:r>
+        <w:rPr>
+          <w:b/>
+          <w:bCs/>
+        </w:rPr>
+        <w:t xml:space="preserve"> </w:t>
+      </w:r>
+      <w:r>
+        <w:rPr>
+          <w:b/>
+          <w:bCs/>
+        </w:rPr>
+        <w:t xml:space="preserve">it appeared in, is collected in</w:t>
+      </w:r>
+      <w:r>
+        <w:rPr>
+          <w:b/>
+          <w:bCs/>
+        </w:rPr>
+        <w:t xml:space="preserve"> </w:t>
+      </w:r>
+      <w:hyperlink r:id="rId28">
+        <w:r>
+          <w:rPr>
+            <w:rStyle w:val="VerbatimChar"/>
+            <w:b/>
+            <w:bCs/>
+          </w:rPr>
+          <w:t xml:space="preserve">COMMANDS.md</w:t>
+        </w:r>
+      </w:hyperlink>
+      <w:r>
+        <w:t xml:space="preserve"> </w:t>
+      </w:r>
+      <w:r>
+        <w:t xml:space="preserve">— including the order to ask them in</w:t>
+      </w:r>
+      <w:r>
+        <w:t xml:space="preserve"> </w:t>
+      </w:r>
+      <w:r>
+        <w:t xml:space="preserve">during an incident. That file is also the growing specification for a portable read-only</w:t>
+      </w:r>
+      <w:r>
+        <w:t xml:space="preserve"> </w:t>
+      </w:r>
+      <w:r>
+        <w:rPr>
+          <w:rStyle w:val="VerbatimChar"/>
+        </w:rPr>
+        <w:t xml:space="preserve">docker-admin.sh</w:t>
+      </w:r>
+      <w:r>
+        <w:t xml:space="preserve">.</w:t>
       </w:r>
     </w:p>
     <w:p>
@@ -5016,8 +5089,8 @@
         </w:pict>
       </w:r>
     </w:p>
-    <w:bookmarkEnd w:id="28"/>
-    <w:bookmarkStart w:id="29" w:name="glossary"/>
+    <w:bookmarkEnd w:id="29"/>
+    <w:bookmarkStart w:id="30" w:name="glossary"/>
     <w:p>
       <w:pPr>
         <w:pStyle w:val="Heading2"/>
@@ -5417,8 +5490,8 @@
         </w:pict>
       </w:r>
     </w:p>
-    <w:bookmarkEnd w:id="29"/>
-    <w:bookmarkStart w:id="30" w:name="check-yourself"/>
+    <w:bookmarkEnd w:id="30"/>
+    <w:bookmarkStart w:id="31" w:name="check-yourself"/>
     <w:p>
       <w:pPr>
         <w:pStyle w:val="Heading2"/>
@@ -5708,8 +5781,8 @@
         <w:t xml:space="preserve">does it matter on a corporate LAN? (§4)</w:t>
       </w:r>
     </w:p>
-    <w:bookmarkEnd w:id="30"/>
     <w:bookmarkEnd w:id="31"/>
+    <w:bookmarkEnd w:id="32"/>
     <w:sectPr>
       <w:pgSz w:h="15840" w:w="12240"/>
       <w:pgMar w:bottom="1440" w:footer="720" w:gutter="0" w:header="720" w:left="1080" w:right="1080" w:top="1440"/>

</xml_diff>

<commit_message>
Reduce the footer to a bare page number
Andrew's call: no "Page", no "of N", no running title. These pages are dense
technical prose and the footer should be furniture nobody notices. The chapter
H1 already names the track, which makes that title line the only place the
topic appears in print - noted in CONVENTIONS so it reads as load-bearing
rather than cosmetic.

Since the footer no longer varies per chapter, the build goes back to one
reference document per track instead of one per chapter, removing the H1
parsing added an hour ago.

Retitling track 1's seven chapters stays a backlog item, applied only when a
chapter is being edited for another reason.

Co-authored-by: Cursor <cursoragent@cursor.com>
</commit_message>
<xml_diff>
--- a/education/docker-swarm/docx/chapter01_building_the_cluster.docx
+++ b/education/docker-swarm/docx/chapter01_building_the_cluster.docx
@@ -5813,43 +5813,10 @@
       </w:rPr>
     </w:pPr>
     <w:r>
-      <w:rPr>
-        <w:rFonts w:ascii="Calibri" w:hAnsi="Calibri"/>
-        <w:sz w:val="18"/>
-        <w:szCs w:val="18"/>
-        <w:color w:val="595959"/>
-      </w:rPr>
-      <w:t xml:space="preserve">Docker Swarm · Chapter 1  ·  Page </w:t>
-    </w:r>
-    <w:r>
       <w:fldChar w:fldCharType="begin"/>
     </w:r>
     <w:r>
       <w:instrText xml:space="preserve"> PAGE </w:instrText>
-    </w:r>
-    <w:r>
-      <w:fldChar w:fldCharType="separate"/>
-    </w:r>
-    <w:r>
-      <w:t>1</w:t>
-    </w:r>
-    <w:r>
-      <w:fldChar w:fldCharType="end"/>
-    </w:r>
-    <w:r>
-      <w:rPr>
-        <w:rFonts w:ascii="Calibri" w:hAnsi="Calibri"/>
-        <w:sz w:val="18"/>
-        <w:szCs w:val="18"/>
-        <w:color w:val="595959"/>
-      </w:rPr>
-      <w:t xml:space="preserve"> of </w:t>
-    </w:r>
-    <w:r>
-      <w:fldChar w:fldCharType="begin"/>
-    </w:r>
-    <w:r>
-      <w:instrText xml:space="preserve"> NUMPAGES </w:instrText>
     </w:r>
     <w:r>
       <w:fldChar w:fldCharType="separate"/>

</xml_diff>

<commit_message>
Full track review: repair chapters 1-2, fix 4-6 factual errors, close C6b by re-drill
Four review agents audited the docker-swarm track; all findings fixed. The
frontend gained the healthcheck the manifest promised, deploy_swarm.sh gained a
per-port smoke gate and a pre-deploy UpdateStatus snapshot, and re-running the
C6b drill flipped it from silent green to a 47s loud rollback with zero
user-visible seconds (P32-P34 confirmed). README gained the Lab-vs-PROD index,
a not-covered list, a reproduce quickstart, a Swarm-K8s table and a capstone.

Co-authored-by: Cursor <cursoragent@cursor.com>
</commit_message>
<xml_diff>
--- a/education/docker-swarm/docx/chapter01_building_the_cluster.docx
+++ b/education/docker-swarm/docx/chapter01_building_the_cluster.docx
@@ -83,7 +83,13 @@
         <w:t xml:space="preserve"> </w:t>
       </w:r>
       <w:r>
-        <w:t xml:space="preserve">Chapter 2 (shipping to it), Chapter 5 (failure drills)</w:t>
+        <w:t xml:space="preserve">Chapter 2 (shipping to it), Chapter 5 (breaking it on purpose), Chapter 6</w:t>
+      </w:r>
+      <w:r>
+        <w:t xml:space="preserve"> </w:t>
+      </w:r>
+      <w:r>
+        <w:t xml:space="preserve">(false greens — where the track’s threads converge)</w:t>
       </w:r>
     </w:p>
     <w:p>
@@ -817,23 +823,62 @@
         <w:t xml:space="preserve"> </w:t>
       </w:r>
       <w:r>
-        <w:t xml:space="preserve">were last told. What you lose is the ability to</w:t>
-      </w:r>
-      <w:r>
-        <w:t xml:space="preserve"> </w:t>
-      </w:r>
-      <w:r>
-        <w:rPr>
-          <w:b/>
-          <w:bCs/>
-        </w:rPr>
-        <w:t xml:space="preserve">change anything</w:t>
-      </w:r>
-      <w:r>
-        <w:t xml:space="preserve"> </w:t>
-      </w:r>
-      <w:r>
-        <w:t xml:space="preserve">— no deploys, no scaling, no</w:t>
+        <w:t xml:space="preserve">were last told. What you lose is the whole management plane — and this is broader than the obvious</w:t>
+      </w:r>
+      <w:r>
+        <w:t xml:space="preserve"> </w:t>
+      </w:r>
+      <w:r>
+        <w:t xml:space="preserve">“no deploys, no scaling”</w:t>
+      </w:r>
+      <w:r>
+        <w:t xml:space="preserve">: ✅</w:t>
+      </w:r>
+      <w:r>
+        <w:t xml:space="preserve"> </w:t>
+      </w:r>
+      <w:r>
+        <w:rPr>
+          <w:b/>
+          <w:bCs/>
+        </w:rPr>
+        <w:t xml:space="preserve">the drill showed that management</w:t>
+      </w:r>
+      <w:r>
+        <w:rPr>
+          <w:b/>
+          <w:bCs/>
+        </w:rPr>
+        <w:t xml:space="preserve"> </w:t>
+      </w:r>
+      <w:r>
+        <w:rPr>
+          <w:b/>
+          <w:bCs/>
+          <w:i/>
+          <w:iCs/>
+        </w:rPr>
+        <w:t xml:space="preserve">reads</w:t>
+      </w:r>
+      <w:r>
+        <w:rPr>
+          <w:b/>
+          <w:bCs/>
+        </w:rPr>
+        <w:t xml:space="preserve"> </w:t>
+      </w:r>
+      <w:r>
+        <w:rPr>
+          <w:b/>
+          <w:bCs/>
+        </w:rPr>
+        <w:t xml:space="preserve">fail too.</w:t>
+      </w:r>
+      <w:r>
+        <w:t xml:space="preserve"> </w:t>
+      </w:r>
+      <w:r>
+        <w:t xml:space="preserve">With quorum gone,</w:t>
       </w:r>
       <w:r>
         <w:t xml:space="preserve"> </w:t>
@@ -842,34 +887,90 @@
         <w:rPr>
           <w:rStyle w:val="VerbatimChar"/>
         </w:rPr>
-        <w:t xml:space="preserve">docker service update</w:t>
-      </w:r>
-      <w:r>
-        <w:t xml:space="preserve">. Degraded is not down, and chapter 5 makes this concrete because</w:t>
-      </w:r>
-      <w:r>
-        <w:t xml:space="preserve"> </w:t>
-      </w:r>
-      <w:r>
-        <w:rPr>
-          <w:b/>
-          <w:bCs/>
-        </w:rPr>
-        <w:t xml:space="preserve">the</w:t>
-      </w:r>
-      <w:r>
-        <w:rPr>
-          <w:b/>
-          <w:bCs/>
-        </w:rPr>
-        <w:t xml:space="preserve"> </w:t>
-      </w:r>
-      <w:r>
-        <w:rPr>
-          <w:b/>
-          <w:bCs/>
-        </w:rPr>
-        <w:t xml:space="preserve">instinct to</w:t>
+        <w:t xml:space="preserve">docker service ls</w:t>
+      </w:r>
+      <w:r>
+        <w:t xml:space="preserve"> </w:t>
+      </w:r>
+      <w:r>
+        <w:t xml:space="preserve">and</w:t>
+      </w:r>
+      <w:r>
+        <w:t xml:space="preserve"> </w:t>
+      </w:r>
+      <w:r>
+        <w:rPr>
+          <w:rStyle w:val="VerbatimChar"/>
+        </w:rPr>
+        <w:t xml:space="preserve">docker node ls</w:t>
+      </w:r>
+      <w:r>
+        <w:t xml:space="preserve"> </w:t>
+      </w:r>
+      <w:r>
+        <w:t xml:space="preserve">return errors rather than stale answers, so you cannot even</w:t>
+      </w:r>
+      <w:r>
+        <w:t xml:space="preserve"> </w:t>
+      </w:r>
+      <w:r>
+        <w:rPr>
+          <w:i/>
+          <w:iCs/>
+        </w:rPr>
+        <w:t xml:space="preserve">list</w:t>
+      </w:r>
+      <w:r>
+        <w:t xml:space="preserve"> </w:t>
+      </w:r>
+      <w:r>
+        <w:t xml:space="preserve">what the cluster is running from a manager. Your inventory during the outage is</w:t>
+      </w:r>
+      <w:r>
+        <w:t xml:space="preserve"> </w:t>
+      </w:r>
+      <w:r>
+        <w:rPr>
+          <w:rStyle w:val="VerbatimChar"/>
+        </w:rPr>
+        <w:t xml:space="preserve">docker ps</w:t>
+      </w:r>
+      <w:r>
+        <w:t xml:space="preserve"> </w:t>
+      </w:r>
+      <w:r>
+        <w:t xml:space="preserve">node by node, and</w:t>
+      </w:r>
+      <w:r>
+        <w:t xml:space="preserve"> </w:t>
+      </w:r>
+      <w:r>
+        <w:rPr>
+          <w:rStyle w:val="VerbatimChar"/>
+        </w:rPr>
+        <w:t xml:space="preserve">curl</w:t>
+      </w:r>
+      <w:r>
+        <w:t xml:space="preserve"> </w:t>
+      </w:r>
+      <w:r>
+        <w:t xml:space="preserve">from outside. Degraded is not down, and Chapter 5 §2 walks the whole hour,</w:t>
+      </w:r>
+      <w:r>
+        <w:t xml:space="preserve"> </w:t>
+      </w:r>
+      <w:r>
+        <w:t xml:space="preserve">because</w:t>
+      </w:r>
+      <w:r>
+        <w:t xml:space="preserve"> </w:t>
+      </w:r>
+      <w:r>
+        <w:rPr>
+          <w:b/>
+          <w:bCs/>
+        </w:rPr>
+        <w:t xml:space="preserve">the instinct to</w:t>
       </w:r>
       <w:r>
         <w:rPr>
@@ -3409,13 +3510,59 @@
         <w:t xml:space="preserve"> </w:t>
       </w:r>
       <w:r>
-        <w:t xml:space="preserve">while its manager component is out of contact and no longer counting toward quorum. Watch only STATUS</w:t>
-      </w:r>
-      <w:r>
-        <w:t xml:space="preserve"> </w:t>
-      </w:r>
-      <w:r>
-        <w:t xml:space="preserve">and you will not see quorum erode until you try to deploy.</w:t>
+        <w:t xml:space="preserve">while its manager component is out of contact and no longer counting toward quorum. Watch MANAGER</w:t>
+      </w:r>
+      <w:r>
+        <w:t xml:space="preserve"> </w:t>
+      </w:r>
+      <w:r>
+        <w:t xml:space="preserve">STATUS, not just STATUS — and know the failure shape in advance: once quorum is actually gone,</w:t>
+      </w:r>
+      <w:r>
+        <w:t xml:space="preserve"> </w:t>
+      </w:r>
+      <w:r>
+        <w:rPr>
+          <w:rStyle w:val="VerbatimChar"/>
+        </w:rPr>
+        <w:t xml:space="preserve">docker node ls</w:t>
+      </w:r>
+      <w:r>
+        <w:t xml:space="preserve"> </w:t>
+      </w:r>
+      <w:r>
+        <w:t xml:space="preserve">itself stops answering (✅ measured — Chapter 5 §2), so you will not be reading this table</w:t>
+      </w:r>
+      <w:r>
+        <w:t xml:space="preserve"> </w:t>
+      </w:r>
+      <w:r>
+        <w:rPr>
+          <w:i/>
+          <w:iCs/>
+        </w:rPr>
+        <w:t xml:space="preserve">during</w:t>
+      </w:r>
+      <w:r>
+        <w:t xml:space="preserve"> </w:t>
+      </w:r>
+      <w:r>
+        <w:t xml:space="preserve">the incident. The time to notice</w:t>
+      </w:r>
+      <w:r>
+        <w:t xml:space="preserve"> </w:t>
+      </w:r>
+      <w:r>
+        <w:rPr>
+          <w:rStyle w:val="VerbatimChar"/>
+        </w:rPr>
+        <w:t xml:space="preserve">Unreachable</w:t>
+      </w:r>
+      <w:r>
+        <w:t xml:space="preserve"> </w:t>
+      </w:r>
+      <w:r>
+        <w:t xml:space="preserve">creeping in is while you still can.</w:t>
       </w:r>
     </w:p>
     <w:p>
@@ -3457,6 +3604,36 @@
       </w:r>
       <w:r>
         <w:t xml:space="preserve">.</w:t>
+      </w:r>
+      <w:r>
+        <w:t xml:space="preserve"> </w:t>
+      </w:r>
+      <w:r>
+        <w:t xml:space="preserve">⚠️</w:t>
+      </w:r>
+      <w:r>
+        <w:t xml:space="preserve"> </w:t>
+      </w:r>
+      <w:r>
+        <w:rPr>
+          <w:i/>
+          <w:iCs/>
+        </w:rPr>
+        <w:t xml:space="preserve">Described, not exercised: this lab has never actually drained a node — the reboot drill in Chapter 5</w:t>
+      </w:r>
+      <w:r>
+        <w:rPr>
+          <w:i/>
+          <w:iCs/>
+        </w:rPr>
+        <w:t xml:space="preserve"> </w:t>
+      </w:r>
+      <w:r>
+        <w:rPr>
+          <w:i/>
+          <w:iCs/>
+        </w:rPr>
+        <w:t xml:space="preserve">§3 rebooted one live instead, which is precisely what drain exists to avoid.</w:t>
       </w:r>
     </w:p>
     <w:p>
@@ -4733,6 +4910,18 @@
         <w:t xml:space="preserve">&gt;</w:t>
       </w:r>
       <w:r>
+        <w:rPr>
+          <w:rStyle w:val="NormalTok"/>
+        </w:rPr>
+        <w:t xml:space="preserve">   </w:t>
+      </w:r>
+      <w:r>
+        <w:rPr>
+          <w:rStyle w:val="CommentTok"/>
+        </w:rPr>
+        <w:t xml:space="preserve"># ⚠️ never run in this lab</w:t>
+      </w:r>
+      <w:r>
         <w:br/>
       </w:r>
       <w:r>
@@ -4955,7 +5144,7 @@
         <w:rPr>
           <w:rStyle w:val="CommentTok"/>
         </w:rPr>
-        <w:t xml:space="preserve"># demoting the last manager is refused</w:t>
+        <w:t xml:space="preserve"># demoting the last manager is refused  ⚠️ never run in this lab</w:t>
       </w:r>
     </w:p>
     <w:p>

</xml_diff>